<commit_message>
Use a fixed Elastic IP (3.7.153.70) for the AWS deployment
- README, LaTeX/PDF report and both Word reports point to the permanent address
- deploy_aws_ec2.sh --destroy also releases the Elastic IP

Co-Authored-By: Claude Opus 5.5 <noreply@anthropic.com>
</commit_message>
<xml_diff>
--- a/report/HealthGraph_Lab_Record.docx
+++ b/report/HealthGraph_Lab_Record.docx
@@ -3054,7 +3054,7 @@
         <w:t xml:space="preserve">Container &amp; cloud:</w:t>
       </w:r>
       <w:r>
-        <w:t xml:space="preserve"> Docker image (non-root, health check) deployed on AWS EC2 free tier (t3.micro, Mumbai region); ≈0.4 s per prediction.</w:t>
+        <w:t xml:space="preserve"> Docker image (non-root, health check) deployed on AWS EC2 free tier (t3.micro, Mumbai region, fixed Elastic IP); ≈0.4 s per prediction.</w:t>
       </w:r>
     </w:p>
     <w:p>
@@ -3075,7 +3075,7 @@
         <w:t xml:space="preserve">Live link:</w:t>
       </w:r>
       <w:r>
-        <w:t xml:space="preserve"> http://15.252.73.160/ui   ·   </w:t>
+        <w:t xml:space="preserve"> http://3.7.153.70/ui   ·   </w:t>
       </w:r>
       <w:r>
         <w:rPr>

</xml_diff>